<commit_message>
Cut lab 1 report to 7 pages and give the handoff page targets
Drops four figures whose numbers already appear in the text, drops the
standalone snapshots section, shrinks the rest to 3.1 inches and tightens
the typography. Sixteen pages down to seven; page seven is 71 percent
full and cutting further would remove graded answers.

Handoff now carries a page target per lab with its source: about six for
labs 1 and 2 by instruction, around three for lab 3 from its brief, and
no limit for lab 4, whose brief asks for coverage of every non-code task
instead. Adds the order to cut in.
</commit_message>
<xml_diff>
--- a/lab1/Lab_1_report_group6.docx
+++ b/lab1/Lab_1_report_group6.docx
@@ -36,15 +36,9 @@
       </w:r>
     </w:p>
     <w:p>
-      <w:r>
-        <w:rPr>
-          <w:i w:val="0"/>
-        </w:rPr>
-      </w:r>
-    </w:p>
-    <w:p>
       <w:pPr>
         <w:pStyle w:val="Heading1"/>
+        <w:spacing w:before="160" w:after="60"/>
       </w:pPr>
       <w:r>
         <w:t>Contributions</w:t>
@@ -67,15 +61,9 @@
       </w:r>
     </w:p>
     <w:p>
-      <w:r>
-        <w:rPr>
-          <w:i w:val="0"/>
-        </w:rPr>
-      </w:r>
-    </w:p>
-    <w:p>
       <w:pPr>
         <w:pStyle w:val="Heading1"/>
+        <w:spacing w:before="160" w:after="60"/>
       </w:pPr>
       <w:r>
         <w:t>Videos</w:t>
@@ -122,13 +110,9 @@
       </w:r>
     </w:p>
     <w:p>
-      <w:r>
-        <w:br w:type="page"/>
-      </w:r>
-    </w:p>
-    <w:p>
       <w:pPr>
         <w:pStyle w:val="Heading1"/>
+        <w:spacing w:before="160" w:after="60"/>
       </w:pPr>
       <w:r>
         <w:t>1. ROS 2</w:t>
@@ -139,20 +123,13 @@
         <w:rPr>
           <w:i w:val="0"/>
         </w:rPr>
-        <w:t>ROS 2 is a framework in which programs, called nodes, exchange messages on named topics. A node publishes on a topic and every node that subscribes to that topic receives the message. There is no direct link between them, so nodes can be started, stopped and replaced on their own.</w:t>
-      </w:r>
-    </w:p>
-    <w:p>
-      <w:r>
-        <w:rPr>
-          <w:i w:val="0"/>
-        </w:rPr>
-        <w:t>On the robot, robot.launch.py starts the driver. The driver publishes /odom, /scan and /tf, and subscribes to /cmd_vel. On the laptop, our node subscribes to /odom and /new_position and publishes /cmd_vel. The two machines find each other automatically over the network as long as both use the same ROS_DOMAIN_ID, which was 32 for turtle2. Turning the robot on is not enough on its own: we first open an SSH shell on the robot and start robot.launch.py, and only then can commands from the laptop move it.</w:t>
+        <w:t>ROS 2 is a framework in which programs, called nodes, exchange messages on named topics. A node publishes on a topic and every subscriber to that topic receives the message, with no direct link between them. On the robot, robot.launch.py starts the driver, which publishes /odom, /scan and /tf and subscribes to /cmd_vel. On the laptop, our node subscribes to /odom and /new_position and publishes /cmd_vel. The two machines find each other over the network as long as both use the same ROS_DOMAIN_ID, which was 32 for turtle2. Turning the robot on is not enough: we first start robot.launch.py over SSH, and only then can the laptop move it.</w:t>
       </w:r>
     </w:p>
     <w:p>
       <w:pPr>
         <w:pStyle w:val="Heading1"/>
+        <w:spacing w:before="160" w:after="60"/>
       </w:pPr>
       <w:r>
         <w:t>2. Block diagram</w:t>
@@ -173,7 +150,7 @@
       <w:r>
         <w:drawing>
           <wp:inline xmlns:a="http://schemas.openxmlformats.org/drawingml/2006/main" xmlns:pic="http://schemas.openxmlformats.org/drawingml/2006/picture">
-            <wp:extent cx="4663440" cy="2674578"/>
+            <wp:extent cx="2834640" cy="1625724"/>
             <wp:docPr id="1" name="Picture 1"/>
             <wp:cNvGraphicFramePr>
               <a:graphicFrameLocks noChangeAspect="1"/>
@@ -194,7 +171,7 @@
                   <pic:spPr>
                     <a:xfrm>
                       <a:off x="0" y="0"/>
-                      <a:ext cx="4663440" cy="2674578"/>
+                      <a:ext cx="2834640" cy="1625724"/>
                     </a:xfrm>
                     <a:prstGeom prst="rect"/>
                   </pic:spPr>
@@ -207,12 +184,13 @@
     </w:p>
     <w:p>
       <w:pPr>
+        <w:spacing w:after="160"/>
         <w:jc w:val="center"/>
       </w:pPr>
       <w:r>
         <w:rPr>
           <w:i/>
-          <w:sz w:val="19"/>
+          <w:sz w:val="18"/>
         </w:rPr>
         <w:t>Figure 1: The two control loops. The position controller is driven by a goal on /new_position and closes the loop on odometry. The wall follower has no goal and closes the loop on the laser scan.</w:t>
       </w:r>
@@ -222,7 +200,7 @@
         <w:rPr>
           <w:i w:val="0"/>
         </w:rPr>
-        <w:t>There are three levels of control in the system. Level 1 is ours and is the only one we wrote: it turns a goal into v and omega. Level 2 is the wheel speed controller in the OpenCR firmware on the robot, which turns v and omega into the speed of each wheel. Level 3 is the motors themselves. We never see levels 2 and 3, which is the point of sending a velocity rather than a motor command.</w:t>
+        <w:t>There are three levels of control. Level 1 is ours and the only one we wrote: it turns a goal into v and omega. Level 2 is the wheel speed controller in the OpenCR firmware, which turns v and omega into the speed of each wheel. Level 3 is the motors. We never see levels 2 and 3, which is the point of sending a velocity rather than a motor command.</w:t>
       </w:r>
     </w:p>
     <w:p>
@@ -230,12 +208,13 @@
         <w:rPr>
           <w:i w:val="0"/>
         </w:rPr>
-        <w:t>The feedback differs between the two loops. The position controller is fed back the pose the robot computes from its wheel encoders and IMU, on /odom. The wall follower is fed back the raw distances from the lidar, on /scan, and never uses the pose to steer. It uses odometry only to notice that a lap has closed.</w:t>
+        <w:t>The feedback differs between the loops. The position controller closes on the pose from the wheel encoders and IMU, on /odom. The wall follower closes on the raw lidar distances, on /scan, and never uses the pose to steer; it uses odometry only to notice a lap has closed.</w:t>
       </w:r>
     </w:p>
     <w:p>
       <w:pPr>
         <w:pStyle w:val="Heading1"/>
+        <w:spacing w:before="160" w:after="60"/>
       </w:pPr>
       <w:r>
         <w:t>3. The robot model, and how the control input is computed</w:t>
@@ -370,13 +349,9 @@
       </w:r>
     </w:p>
     <w:p>
-      <w:r>
-        <w:br w:type="page"/>
-      </w:r>
-    </w:p>
-    <w:p>
       <w:pPr>
         <w:pStyle w:val="Heading1"/>
+        <w:spacing w:before="160" w:after="60"/>
       </w:pPr>
       <w:r>
         <w:t>4. Task 1: position control</w:t>
@@ -397,7 +372,7 @@
       <w:r>
         <w:drawing>
           <wp:inline xmlns:a="http://schemas.openxmlformats.org/drawingml/2006/main" xmlns:pic="http://schemas.openxmlformats.org/drawingml/2006/picture">
-            <wp:extent cx="4663440" cy="4706770"/>
+            <wp:extent cx="2834640" cy="2860978"/>
             <wp:docPr id="2" name="Picture 2"/>
             <wp:cNvGraphicFramePr>
               <a:graphicFrameLocks noChangeAspect="1"/>
@@ -418,7 +393,7 @@
                   <pic:spPr>
                     <a:xfrm>
                       <a:off x="0" y="0"/>
-                      <a:ext cx="4663440" cy="4706770"/>
+                      <a:ext cx="2834640" cy="2860978"/>
                     </a:xfrm>
                     <a:prstGeom prst="rect"/>
                   </pic:spPr>
@@ -431,12 +406,13 @@
     </w:p>
     <w:p>
       <w:pPr>
+        <w:spacing w:after="160"/>
         <w:jc w:val="center"/>
       </w:pPr>
       <w:r>
         <w:rPr>
           <w:i/>
-          <w:sz w:val="19"/>
+          <w:sz w:val="18"/>
         </w:rPr>
         <w:t>Figure 2: Task 1 on the robot. The path of the robot centre and of the controlled point P, against the goals that were sent.</w:t>
       </w:r>
@@ -446,20 +422,13 @@
         <w:rPr>
           <w:i w:val="0"/>
         </w:rPr>
-        <w:t>The robot centre stopped about 0.10 to 0.14 m short of each goal. That is expected: the goal is where P stops, and P is 0.10 m ahead of the centre. For the first goal, one metre forward, the centre stopped at x = 0.862 m and P at x = 0.961 m. Setting the parameter goal_defines to robot_centre shifts the goal forward by L, so that the centre lands on it instead.</w:t>
-      </w:r>
-    </w:p>
-    <w:p>
-      <w:r>
-        <w:rPr>
-          <w:i w:val="0"/>
-        </w:rPr>
-        <w:t>The first goal is missing from the bag. It was published once, before the recorder had matched the topic, so we know it only from where P stopped.</w:t>
+        <w:t>The centre stopped 0.10 to 0.14 m short of each goal, as expected: the goal is where P stops and P is 0.10 m ahead of the centre. For the first goal, one metre forward, the centre stopped at x = 0.862 m and P at x = 0.961 m. Setting goal_defines to robot_centre shifts the goal forward by L so the centre lands on it instead. The first goal is missing from the bag: it was published once, before the recorder had matched the topic.</w:t>
       </w:r>
     </w:p>
     <w:p>
       <w:pPr>
         <w:pStyle w:val="Heading2"/>
+        <w:spacing w:before="160" w:after="60"/>
       </w:pPr>
       <w:r>
         <w:t>Why the robot curves before driving back to a point</w:t>
@@ -470,20 +439,13 @@
         <w:rPr>
           <w:i w:val="0"/>
         </w:rPr>
-        <w:t>We were asked why the robot curves and corrects its heading when it is sent back to a coordinate behind it. When the goal is behind the robot, the error vector u points backwards. Its component along the heading is negative, so v is negative and the robot reverses. Its sideways component is divided by L = 0.10 m, which gives a large omega. In the bag, v reached about -0.22 m/s and omega about 2.2 rad/s, which is 0.22 / 0.10.</w:t>
-      </w:r>
-    </w:p>
-    <w:p>
-      <w:r>
-        <w:rPr>
-          <w:i w:val="0"/>
-        </w:rPr>
-        <w:t>The robot therefore reverses while it swings round, and that is the curve. It drives forward again once P points at the goal. It never turns on the spot first, because the near identity diffeomorphism does not control the heading at all.</w:t>
+        <w:t>When the goal is behind the robot, the error vector u points backwards. Its component along the heading is negative, so v is negative and the robot reverses, and its sideways component divided by L = 0.10 m gives a large omega. In the bag, v reached about -0.22 m/s and omega about 2.2 rad/s, which is 0.22 / 0.10. The robot therefore reverses while it swings round, and that is the curve. It drives forward again once P points at the goal, and never turns on the spot first, because the near identity diffeomorphism does not control heading at all.</w:t>
       </w:r>
     </w:p>
     <w:p>
       <w:pPr>
         <w:pStyle w:val="Heading1"/>
+        <w:spacing w:before="160" w:after="60"/>
       </w:pPr>
       <w:r>
         <w:t>5. Task 2: the figure of eight</w:t>
@@ -492,6 +454,7 @@
     <w:p>
       <w:pPr>
         <w:pStyle w:val="Heading2"/>
+        <w:spacing w:before="160" w:after="60"/>
       </w:pPr>
       <w:r>
         <w:t>How the eight is generated</w:t>
@@ -532,7 +495,7 @@
       <w:r>
         <w:drawing>
           <wp:inline xmlns:a="http://schemas.openxmlformats.org/drawingml/2006/main" xmlns:pic="http://schemas.openxmlformats.org/drawingml/2006/picture">
-            <wp:extent cx="4663440" cy="2940669"/>
+            <wp:extent cx="2834640" cy="1787465"/>
             <wp:docPr id="3" name="Picture 3"/>
             <wp:cNvGraphicFramePr>
               <a:graphicFrameLocks noChangeAspect="1"/>
@@ -553,7 +516,7 @@
                   <pic:spPr>
                     <a:xfrm>
                       <a:off x="0" y="0"/>
-                      <a:ext cx="4663440" cy="2940669"/>
+                      <a:ext cx="2834640" cy="1787465"/>
                     </a:xfrm>
                     <a:prstGeom prst="rect"/>
                   </pic:spPr>
@@ -566,12 +529,13 @@
     </w:p>
     <w:p>
       <w:pPr>
+        <w:spacing w:after="160"/>
         <w:jc w:val="center"/>
       </w:pPr>
       <w:r>
         <w:rPr>
           <w:i/>
-          <w:sz w:val="19"/>
+          <w:sz w:val="18"/>
         </w:rPr>
         <w:t>Figure 3: Task 2 on the robot. The path of P against the commanded figure of eight, for two laps.</w:t>
       </w:r>
@@ -579,6 +543,7 @@
     <w:p>
       <w:pPr>
         <w:pStyle w:val="Heading2"/>
+        <w:spacing w:before="160" w:after="60"/>
       </w:pPr>
       <w:r>
         <w:t>What we saw</w:t>
@@ -589,58 +554,7 @@
         <w:rPr>
           <w:i w:val="0"/>
         </w:rPr>
-        <w:t>The robot drew the right shape, but late. A proportional controller only acts on an error that already exists, so it follows a moving goal with a delay of about 1 / k_p = 1.25 s. In Gazebo the best fit delay was 1.25 s. On the robot it was 1.35 s, and once that delay is removed the remaining error of P is only about 0.014 m. The extra 0.10 s matches the 130 to 270 ms we measured between a command and the robot responding to it.</w:t>
-      </w:r>
-    </w:p>
-    <w:p>
-      <w:pPr>
-        <w:jc w:val="center"/>
-      </w:pPr>
-      <w:r>
-        <w:drawing>
-          <wp:inline xmlns:a="http://schemas.openxmlformats.org/drawingml/2006/main" xmlns:pic="http://schemas.openxmlformats.org/drawingml/2006/picture">
-            <wp:extent cx="4480560" cy="2703703"/>
-            <wp:docPr id="4" name="Picture 4"/>
-            <wp:cNvGraphicFramePr>
-              <a:graphicFrameLocks noChangeAspect="1"/>
-            </wp:cNvGraphicFramePr>
-            <a:graphic>
-              <a:graphicData uri="http://schemas.openxmlformats.org/drawingml/2006/picture">
-                <pic:pic>
-                  <pic:nvPicPr>
-                    <pic:cNvPr id="0" name="lab1_task2_delay.png"/>
-                    <pic:cNvPicPr/>
-                  </pic:nvPicPr>
-                  <pic:blipFill>
-                    <a:blip r:embed="rId12"/>
-                    <a:stretch>
-                      <a:fillRect/>
-                    </a:stretch>
-                  </pic:blipFill>
-                  <pic:spPr>
-                    <a:xfrm>
-                      <a:off x="0" y="0"/>
-                      <a:ext cx="4480560" cy="2703703"/>
-                    </a:xfrm>
-                    <a:prstGeom prst="rect"/>
-                  </pic:spPr>
-                </pic:pic>
-              </a:graphicData>
-            </a:graphic>
-          </wp:inline>
-        </w:drawing>
-      </w:r>
-    </w:p>
-    <w:p>
-      <w:pPr>
-        <w:jc w:val="center"/>
-      </w:pPr>
-      <w:r>
-        <w:rPr>
-          <w:i/>
-          <w:sz w:val="19"/>
-        </w:rPr>
-        <w:t>Figure 4: The tracking error against an assumed delay. The minimum is at 1.35 s on the robot, against 1.25 s in Gazebo.</w:t>
+        <w:t>The robot drew the right shape, but late. A proportional controller only acts on an error that already exists, so it follows a moving goal with a delay of about 1 / k_p = 1.25 s. In Gazebo the best fit delay was 1.25 s; on the robot it was 1.35 s, and with that delay removed the remaining error of P is only about 0.014 m. The extra 0.10 s matches the 130 to 270 ms we measured between a command and the robot responding. The mean error of P was 0.083 m, against v / k_p = 0.061 / 0.8 = 0.076 m predicted by the same argument.</w:t>
       </w:r>
     </w:p>
     <w:p>
@@ -648,76 +562,13 @@
         <w:rPr>
           <w:i w:val="0"/>
         </w:rPr>
-        <w:t>The mean error of P was 0.083 m, against v / k_p = 0.061 / 0.8 = 0.076 m predicted by the same argument.</w:t>
-      </w:r>
-    </w:p>
-    <w:p>
-      <w:pPr>
-        <w:jc w:val="center"/>
-      </w:pPr>
-      <w:r>
-        <w:drawing>
-          <wp:inline xmlns:a="http://schemas.openxmlformats.org/drawingml/2006/main" xmlns:pic="http://schemas.openxmlformats.org/drawingml/2006/picture">
-            <wp:extent cx="4480560" cy="2076826"/>
-            <wp:docPr id="5" name="Picture 5"/>
-            <wp:cNvGraphicFramePr>
-              <a:graphicFrameLocks noChangeAspect="1"/>
-            </wp:cNvGraphicFramePr>
-            <a:graphic>
-              <a:graphicData uri="http://schemas.openxmlformats.org/drawingml/2006/picture">
-                <pic:pic>
-                  <pic:nvPicPr>
-                    <pic:cNvPr id="0" name="lab1_task2_error.png"/>
-                    <pic:cNvPicPr/>
-                  </pic:nvPicPr>
-                  <pic:blipFill>
-                    <a:blip r:embed="rId13"/>
-                    <a:stretch>
-                      <a:fillRect/>
-                    </a:stretch>
-                  </pic:blipFill>
-                  <pic:spPr>
-                    <a:xfrm>
-                      <a:off x="0" y="0"/>
-                      <a:ext cx="4480560" cy="2076826"/>
-                    </a:xfrm>
-                    <a:prstGeom prst="rect"/>
-                  </pic:spPr>
-                </pic:pic>
-              </a:graphicData>
-            </a:graphic>
-          </wp:inline>
-        </w:drawing>
-      </w:r>
-    </w:p>
-    <w:p>
-      <w:pPr>
-        <w:jc w:val="center"/>
-      </w:pPr>
-      <w:r>
-        <w:rPr>
-          <w:i/>
-          <w:sz w:val="19"/>
-        </w:rPr>
-        <w:t>Figure 5: Tracking error over the run. The jumps follow the gaps in the odometry stream.</w:t>
-      </w:r>
-    </w:p>
-    <w:p>
-      <w:r>
-        <w:rPr>
-          <w:i w:val="0"/>
-        </w:rPr>
-        <w:t>Two other things are visible in the bag. The robot first reversed about 5 cm, because P started 0.10 m ahead of the first goal. And odometry stopped reaching the laptop for more than 0.5 s on five occasions while the robot was moving, the longest gap being 2.6 s. Each time, the controller stopped the robot, because its odometry timeout is 0.5 s, and the tracking error jumped once the stream restarted.</w:t>
-      </w:r>
-    </w:p>
-    <w:p>
-      <w:r>
-        <w:br w:type="page"/>
+        <w:t>Two other things are visible in the bag. The robot first reversed about 5 cm, because P started 0.10 m ahead of the first goal. And odometry stopped reaching the laptop for more than 0.5 s on five occasions while the robot was moving, the longest gap 2.6 s. Each time the controller stopped the robot, because its odometry timeout is 0.5 s, and the tracking error jumped once the stream restarted.</w:t>
       </w:r>
     </w:p>
     <w:p>
       <w:pPr>
         <w:pStyle w:val="Heading1"/>
+        <w:spacing w:before="160" w:after="60"/>
       </w:pPr>
       <w:r>
         <w:t>6. Task 4: wall following</w:t>
@@ -726,6 +577,7 @@
     <w:p>
       <w:pPr>
         <w:pStyle w:val="Heading2"/>
+        <w:spacing w:before="160" w:after="60"/>
       </w:pPr>
       <w:r>
         <w:t>How the lidar lets the robot follow a wall</w:t>
@@ -736,7 +588,7 @@
         <w:rPr>
           <w:i w:val="0"/>
         </w:rPr>
-        <w:t>The lidar spins and measures the distance to whatever is around the robot, one beam per degree. The node reads the beams on the right side and takes the closest one as the distance to the wall. If the robot is too far from the wall it turns towards it, and if it is too close it turns away:</w:t>
+        <w:t>The lidar measures the distance to whatever is around the robot, one beam per degree. The node reads the beams on the right and takes the closest as the distance to the wall. Too far from the wall and it turns towards it, too close and it turns away:</w:t>
       </w:r>
     </w:p>
     <w:p>
@@ -756,12 +608,13 @@
         <w:rPr>
           <w:i w:val="0"/>
         </w:rPr>
-        <w:t>Two beams 40 degrees apart also give the angle of the wall, so the robot can straighten up before it drifts. If anything is closer than 0.35 m in front, it stops driving forward and turns on the spot. It stops for good when odometry says it is back where the lap started.</w:t>
+        <w:t>Two beams 40 degrees apart give the angle of the wall, so the robot straightens up before it drifts. If anything is closer than 0.35 m in front, it stops driving forward and turns on the spot. It stops for good when odometry says it is back where the lap started.</w:t>
       </w:r>
     </w:p>
     <w:p>
       <w:pPr>
         <w:pStyle w:val="Heading2"/>
+        <w:spacing w:before="160" w:after="60"/>
       </w:pPr>
       <w:r>
         <w:t>What happened in the lab</w:t>
@@ -772,63 +625,13 @@
         <w:rPr>
           <w:i w:val="0"/>
         </w:rPr>
-        <w:t>The teacher placed a 3D printed maze block of about 0.25 by 0.25 m and asked us to follow it as the wall. The robot followed the block for a while, but from too far away. It then made loops and never got all the way round and back. It never hit anything, including the teacher when he stepped in front of it, because of the 0.35 m front stop. Our task 4 bag holds only 129 s of the robot standing at its start position, so the motion itself was not recorded.</w:t>
-      </w:r>
-    </w:p>
-    <w:p>
-      <w:pPr>
-        <w:jc w:val="center"/>
-      </w:pPr>
-      <w:r>
-        <w:drawing>
-          <wp:inline xmlns:a="http://schemas.openxmlformats.org/drawingml/2006/main" xmlns:pic="http://schemas.openxmlformats.org/drawingml/2006/picture">
-            <wp:extent cx="4297680" cy="3119362"/>
-            <wp:docPr id="6" name="Picture 6"/>
-            <wp:cNvGraphicFramePr>
-              <a:graphicFrameLocks noChangeAspect="1"/>
-            </wp:cNvGraphicFramePr>
-            <a:graphic>
-              <a:graphicData uri="http://schemas.openxmlformats.org/drawingml/2006/picture">
-                <pic:pic>
-                  <pic:nvPicPr>
-                    <pic:cNvPr id="0" name="lab1_task4_robot_start.png"/>
-                    <pic:cNvPicPr/>
-                  </pic:nvPicPr>
-                  <pic:blipFill>
-                    <a:blip r:embed="rId14"/>
-                    <a:stretch>
-                      <a:fillRect/>
-                    </a:stretch>
-                  </pic:blipFill>
-                  <pic:spPr>
-                    <a:xfrm>
-                      <a:off x="0" y="0"/>
-                      <a:ext cx="4297680" cy="3119362"/>
-                    </a:xfrm>
-                    <a:prstGeom prst="rect"/>
-                  </pic:spPr>
-                </pic:pic>
-              </a:graphicData>
-            </a:graphic>
-          </wp:inline>
-        </w:drawing>
-      </w:r>
-    </w:p>
-    <w:p>
-      <w:pPr>
-        <w:jc w:val="center"/>
-      </w:pPr>
-      <w:r>
-        <w:rPr>
-          <w:i/>
-          <w:sz w:val="19"/>
-        </w:rPr>
-        <w:t>Figure 6: Task 4 on the robot. The start pose beside the block, which is all the bag contains.</w:t>
+        <w:t>The teacher placed a 3D printed maze block of about 0.25 by 0.25 m and asked us to follow it as the wall. The robot followed it for a while, but from too far away, then made loops and never got all the way round. It never hit anything, including the teacher when he stepped in front of it, because of the 0.35 m front stop. Our task 4 bag holds only 129 s of the robot standing at its start position, so the motion itself was not recorded.</w:t>
       </w:r>
     </w:p>
     <w:p>
       <w:pPr>
         <w:pStyle w:val="Heading2"/>
+        <w:spacing w:before="160" w:after="60"/>
       </w:pPr>
       <w:r>
         <w:t>Why it did that</w:t>
@@ -871,7 +674,24 @@
         <w:rPr>
           <w:i w:val="0"/>
         </w:rPr>
-        <w:t>We checked this in a desk simulation with our own wall follower code, a simulated lidar, the 0.25 m block and the settings from the lab day. With the block on the right, as in the lab, the robot went round it about 1.9 times in 90 s at a median distance of 0.46 m, and never stopped. Over 96 different start poses it went round in 50 percent of the runs and closed the loop in none of them.</w:t>
+        <w:t>We checked this in a desk simulation with our own code, a simulated lidar, the 0.25 m block and the lab day settings. With the block on the right, the robot went round it about 1.9 times in 90 s at a median 0.46 m, and never stopped. Over 96 start poses it went round in 50 percent of runs and closed the loop in none.</w:t>
+      </w:r>
+    </w:p>
+    <w:p>
+      <w:pPr>
+        <w:pStyle w:val="Heading2"/>
+        <w:spacing w:before="160" w:after="60"/>
+      </w:pPr>
+      <w:r>
+        <w:t>The wall follower in simulation</w:t>
+      </w:r>
+    </w:p>
+    <w:p>
+      <w:r>
+        <w:rPr>
+          <w:i w:val="0"/>
+        </w:rPr>
+        <w:t>In Gazebo, with the same code and settings as on the lab day, the robot found the wall of the room, followed it round all four sides and stopped within 0.30 m of its lap start after about 15.4 m. The wall follower works on walls long enough for it; the problem in the lab was the size of the block.</w:t>
       </w:r>
     </w:p>
     <w:p>
@@ -881,8 +701,8 @@
       <w:r>
         <w:drawing>
           <wp:inline xmlns:a="http://schemas.openxmlformats.org/drawingml/2006/main" xmlns:pic="http://schemas.openxmlformats.org/drawingml/2006/picture">
-            <wp:extent cx="4297680" cy="3912238"/>
-            <wp:docPr id="7" name="Picture 7"/>
+            <wp:extent cx="2834640" cy="2894177"/>
+            <wp:docPr id="4" name="Picture 4"/>
             <wp:cNvGraphicFramePr>
               <a:graphicFrameLocks noChangeAspect="1"/>
             </wp:cNvGraphicFramePr>
@@ -890,11 +710,11 @@
               <a:graphicData uri="http://schemas.openxmlformats.org/drawingml/2006/picture">
                 <pic:pic>
                   <pic:nvPicPr>
-                    <pic:cNvPr id="0" name="lab1_task4_sim_block.png"/>
+                    <pic:cNvPr id="0" name="lab1_task4_sim.png"/>
                     <pic:cNvPicPr/>
                   </pic:nvPicPr>
                   <pic:blipFill>
-                    <a:blip r:embed="rId15"/>
+                    <a:blip r:embed="rId12"/>
                     <a:stretch>
                       <a:fillRect/>
                     </a:stretch>
@@ -902,7 +722,7 @@
                   <pic:spPr>
                     <a:xfrm>
                       <a:off x="0" y="0"/>
-                      <a:ext cx="4297680" cy="3912238"/>
+                      <a:ext cx="2834640" cy="2894177"/>
                     </a:xfrm>
                     <a:prstGeom prst="rect"/>
                   </pic:spPr>
@@ -915,30 +735,15 @@
     </w:p>
     <w:p>
       <w:pPr>
+        <w:spacing w:after="160"/>
         <w:jc w:val="center"/>
       </w:pPr>
       <w:r>
         <w:rPr>
           <w:i/>
-          <w:sz w:val="19"/>
+          <w:sz w:val="18"/>
         </w:rPr>
-        <w:t>Figure 7: The desk simulation with the 0.25 m block, reproducing the loops we saw in the lab.</w:t>
-      </w:r>
-    </w:p>
-    <w:p>
-      <w:pPr>
-        <w:pStyle w:val="Heading2"/>
-      </w:pPr>
-      <w:r>
-        <w:t>The wall follower in simulation</w:t>
-      </w:r>
-    </w:p>
-    <w:p>
-      <w:r>
-        <w:rPr>
-          <w:i w:val="0"/>
-        </w:rPr>
-        <w:t>We were asked to show the wall following working in simulation. In Gazebo, with the same code and the same settings as on the lab day, the robot found the wall of the room, followed it round all four sides and stopped when it was back within 0.30 m of its lap start, after about 15.4 m. The wall follower therefore works on walls that are long enough for it, and the problem in the lab was the size of the block.</w:t>
+        <w:t>Figure 4: Task 4 in Gazebo. One full lap of the room, stopping where the lap started.</w:t>
       </w:r>
     </w:p>
     <w:p>
@@ -948,8 +753,8 @@
       <w:r>
         <w:drawing>
           <wp:inline xmlns:a="http://schemas.openxmlformats.org/drawingml/2006/main" xmlns:pic="http://schemas.openxmlformats.org/drawingml/2006/picture">
-            <wp:extent cx="4663440" cy="4761389"/>
-            <wp:docPr id="8" name="Picture 8"/>
+            <wp:extent cx="2834640" cy="2727554"/>
+            <wp:docPr id="5" name="Picture 5"/>
             <wp:cNvGraphicFramePr>
               <a:graphicFrameLocks noChangeAspect="1"/>
             </wp:cNvGraphicFramePr>
@@ -957,11 +762,11 @@
               <a:graphicData uri="http://schemas.openxmlformats.org/drawingml/2006/picture">
                 <pic:pic>
                   <pic:nvPicPr>
-                    <pic:cNvPr id="0" name="lab1_task4_sim.png"/>
+                    <pic:cNvPr id="0" name="lab1_task2_snapshot.png"/>
                     <pic:cNvPicPr/>
                   </pic:nvPicPr>
                   <pic:blipFill>
-                    <a:blip r:embed="rId16"/>
+                    <a:blip r:embed="rId13"/>
                     <a:stretch>
                       <a:fillRect/>
                     </a:stretch>
@@ -969,7 +774,7 @@
                   <pic:spPr>
                     <a:xfrm>
                       <a:off x="0" y="0"/>
-                      <a:ext cx="4663440" cy="4761389"/>
+                      <a:ext cx="2834640" cy="2727554"/>
                     </a:xfrm>
                     <a:prstGeom prst="rect"/>
                   </pic:spPr>
@@ -982,257 +787,30 @@
     </w:p>
     <w:p>
       <w:pPr>
+        <w:spacing w:after="160"/>
         <w:jc w:val="center"/>
       </w:pPr>
       <w:r>
         <w:rPr>
           <w:i/>
-          <w:sz w:val="19"/>
+          <w:sz w:val="18"/>
         </w:rPr>
-        <w:t>Figure 8: Task 4 in Gazebo. One full lap of the room, stopping where the lap started.</w:t>
-      </w:r>
-    </w:p>
-    <w:p>
-      <w:r>
-        <w:br w:type="page"/>
+        <w:t>Figure 5: A frame from the RViz replay of task 2, showing the robot, the path so far, the current goal and the laser scan.</w:t>
       </w:r>
     </w:p>
     <w:p>
       <w:pPr>
         <w:pStyle w:val="Heading1"/>
+        <w:spacing w:before="160" w:after="60"/>
       </w:pPr>
       <w:r>
-        <w:t>7. Snapshots from the videos</w:t>
-      </w:r>
-    </w:p>
-    <w:p>
-      <w:r>
-        <w:rPr>
-          <w:i w:val="0"/>
-        </w:rPr>
-        <w:t>The frames below are taken from the RViz replays, seen from above in the odometry frame. Each shows the robot model, the path so far, the current goal and the laser scan.</w:t>
-      </w:r>
-    </w:p>
-    <w:p>
-      <w:pPr>
-        <w:jc w:val="center"/>
-      </w:pPr>
-      <w:r>
-        <w:drawing>
-          <wp:inline xmlns:a="http://schemas.openxmlformats.org/drawingml/2006/main" xmlns:pic="http://schemas.openxmlformats.org/drawingml/2006/picture">
-            <wp:extent cx="4297680" cy="4135323"/>
-            <wp:docPr id="9" name="Picture 9"/>
-            <wp:cNvGraphicFramePr>
-              <a:graphicFrameLocks noChangeAspect="1"/>
-            </wp:cNvGraphicFramePr>
-            <a:graphic>
-              <a:graphicData uri="http://schemas.openxmlformats.org/drawingml/2006/picture">
-                <pic:pic>
-                  <pic:nvPicPr>
-                    <pic:cNvPr id="0" name="lab1_task1_snapshot.png"/>
-                    <pic:cNvPicPr/>
-                  </pic:nvPicPr>
-                  <pic:blipFill>
-                    <a:blip r:embed="rId17"/>
-                    <a:stretch>
-                      <a:fillRect/>
-                    </a:stretch>
-                  </pic:blipFill>
-                  <pic:spPr>
-                    <a:xfrm>
-                      <a:off x="0" y="0"/>
-                      <a:ext cx="4297680" cy="4135323"/>
-                    </a:xfrm>
-                    <a:prstGeom prst="rect"/>
-                  </pic:spPr>
-                </pic:pic>
-              </a:graphicData>
-            </a:graphic>
-          </wp:inline>
-        </w:drawing>
-      </w:r>
-    </w:p>
-    <w:p>
-      <w:pPr>
-        <w:jc w:val="center"/>
-      </w:pPr>
-      <w:r>
-        <w:rPr>
-          <w:i/>
-          <w:sz w:val="19"/>
-        </w:rPr>
-        <w:t>Figure 9: Task 1, back at the last goal after the square of goals.</w:t>
-      </w:r>
-    </w:p>
-    <w:p>
-      <w:pPr>
-        <w:jc w:val="center"/>
-      </w:pPr>
-      <w:r>
-        <w:drawing>
-          <wp:inline xmlns:a="http://schemas.openxmlformats.org/drawingml/2006/main" xmlns:pic="http://schemas.openxmlformats.org/drawingml/2006/picture">
-            <wp:extent cx="4297680" cy="4135323"/>
-            <wp:docPr id="10" name="Picture 10"/>
-            <wp:cNvGraphicFramePr>
-              <a:graphicFrameLocks noChangeAspect="1"/>
-            </wp:cNvGraphicFramePr>
-            <a:graphic>
-              <a:graphicData uri="http://schemas.openxmlformats.org/drawingml/2006/picture">
-                <pic:pic>
-                  <pic:nvPicPr>
-                    <pic:cNvPr id="0" name="lab1_task2_snapshot.png"/>
-                    <pic:cNvPicPr/>
-                  </pic:nvPicPr>
-                  <pic:blipFill>
-                    <a:blip r:embed="rId18"/>
-                    <a:stretch>
-                      <a:fillRect/>
-                    </a:stretch>
-                  </pic:blipFill>
-                  <pic:spPr>
-                    <a:xfrm>
-                      <a:off x="0" y="0"/>
-                      <a:ext cx="4297680" cy="4135323"/>
-                    </a:xfrm>
-                    <a:prstGeom prst="rect"/>
-                  </pic:spPr>
-                </pic:pic>
-              </a:graphicData>
-            </a:graphic>
-          </wp:inline>
-        </w:drawing>
-      </w:r>
-    </w:p>
-    <w:p>
-      <w:pPr>
-        <w:jc w:val="center"/>
-      </w:pPr>
-      <w:r>
-        <w:rPr>
-          <w:i/>
-          <w:sz w:val="19"/>
-        </w:rPr>
-        <w:t>Figure 10: Task 2, near the end of the second lap of the eight.</w:t>
-      </w:r>
-    </w:p>
-    <w:p>
-      <w:pPr>
-        <w:jc w:val="center"/>
-      </w:pPr>
-      <w:r>
-        <w:drawing>
-          <wp:inline xmlns:a="http://schemas.openxmlformats.org/drawingml/2006/main" xmlns:pic="http://schemas.openxmlformats.org/drawingml/2006/picture">
-            <wp:extent cx="4297680" cy="4135323"/>
-            <wp:docPr id="11" name="Picture 11"/>
-            <wp:cNvGraphicFramePr>
-              <a:graphicFrameLocks noChangeAspect="1"/>
-            </wp:cNvGraphicFramePr>
-            <a:graphic>
-              <a:graphicData uri="http://schemas.openxmlformats.org/drawingml/2006/picture">
-                <pic:pic>
-                  <pic:nvPicPr>
-                    <pic:cNvPr id="0" name="lab1_task4_sim_snapshot.png"/>
-                    <pic:cNvPicPr/>
-                  </pic:nvPicPr>
-                  <pic:blipFill>
-                    <a:blip r:embed="rId19"/>
-                    <a:stretch>
-                      <a:fillRect/>
-                    </a:stretch>
-                  </pic:blipFill>
-                  <pic:spPr>
-                    <a:xfrm>
-                      <a:off x="0" y="0"/>
-                      <a:ext cx="4297680" cy="4135323"/>
-                    </a:xfrm>
-                    <a:prstGeom prst="rect"/>
-                  </pic:spPr>
-                </pic:pic>
-              </a:graphicData>
-            </a:graphic>
-          </wp:inline>
-        </w:drawing>
-      </w:r>
-    </w:p>
-    <w:p>
-      <w:pPr>
-        <w:jc w:val="center"/>
-      </w:pPr>
-      <w:r>
-        <w:rPr>
-          <w:i/>
-          <w:sz w:val="19"/>
-        </w:rPr>
-        <w:t>Figure 11: Task 4 in Gazebo, closing the lap round the room.</w:t>
-      </w:r>
-    </w:p>
-    <w:p>
-      <w:pPr>
-        <w:jc w:val="center"/>
-      </w:pPr>
-      <w:r>
-        <w:drawing>
-          <wp:inline xmlns:a="http://schemas.openxmlformats.org/drawingml/2006/main" xmlns:pic="http://schemas.openxmlformats.org/drawingml/2006/picture">
-            <wp:extent cx="4297680" cy="4135323"/>
-            <wp:docPr id="12" name="Picture 12"/>
-            <wp:cNvGraphicFramePr>
-              <a:graphicFrameLocks noChangeAspect="1"/>
-            </wp:cNvGraphicFramePr>
-            <a:graphic>
-              <a:graphicData uri="http://schemas.openxmlformats.org/drawingml/2006/picture">
-                <pic:pic>
-                  <pic:nvPicPr>
-                    <pic:cNvPr id="0" name="lab1_task4_robot_snapshot.png"/>
-                    <pic:cNvPicPr/>
-                  </pic:nvPicPr>
-                  <pic:blipFill>
-                    <a:blip r:embed="rId20"/>
-                    <a:stretch>
-                      <a:fillRect/>
-                    </a:stretch>
-                  </pic:blipFill>
-                  <pic:spPr>
-                    <a:xfrm>
-                      <a:off x="0" y="0"/>
-                      <a:ext cx="4297680" cy="4135323"/>
-                    </a:xfrm>
-                    <a:prstGeom prst="rect"/>
-                  </pic:spPr>
-                </pic:pic>
-              </a:graphicData>
-            </a:graphic>
-          </wp:inline>
-        </w:drawing>
-      </w:r>
-    </w:p>
-    <w:p>
-      <w:pPr>
-        <w:jc w:val="center"/>
-      </w:pPr>
-      <w:r>
-        <w:rPr>
-          <w:i/>
-          <w:sz w:val="19"/>
-        </w:rPr>
-        <w:t>Figure 12: Task 4 on the robot, the start pose beside the wall.</w:t>
-      </w:r>
-    </w:p>
-    <w:p>
-      <w:r>
-        <w:br w:type="page"/>
-      </w:r>
-    </w:p>
-    <w:p>
-      <w:pPr>
-        <w:pStyle w:val="Heading1"/>
-      </w:pPr>
-      <w:r>
-        <w:t>8. Reflections on the experiment</w:t>
+        <w:t>7. Reflections on the experiment</w:t>
       </w:r>
     </w:p>
     <w:p>
       <w:pPr>
         <w:pStyle w:val="Heading2"/>
+        <w:spacing w:before="160" w:after="60"/>
       </w:pPr>
       <w:r>
         <w:t>Do you observe any difference between controlling the robot in simulation and controlling the physical robot in real time?</w:t>
@@ -1249,6 +827,7 @@
     <w:p>
       <w:pPr>
         <w:pStyle w:val="Heading2"/>
+        <w:spacing w:before="160" w:after="60"/>
       </w:pPr>
       <w:r>
         <w:t>How comparable is the robot’s actual performance to its performance in simulation?</w:t>
@@ -1265,6 +844,7 @@
     <w:p>
       <w:pPr>
         <w:pStyle w:val="Heading2"/>
+        <w:spacing w:before="160" w:after="60"/>
       </w:pPr>
       <w:r>
         <w:t>Where does the physical TurtleBot obtain its odometry information from?</w:t>
@@ -1281,6 +861,7 @@
     <w:p>
       <w:pPr>
         <w:pStyle w:val="Heading2"/>
+        <w:spacing w:before="160" w:after="60"/>
       </w:pPr>
       <w:r>
         <w:t>What changes, adjustments, or additional considerations are required for sim-to-real transfer?</w:t>
@@ -1667,9 +1248,12 @@
     <w:name w:val="Normal"/>
     <w:qFormat/>
     <w:rsid w:val="00FC693F"/>
+    <w:pPr>
+      <w:spacing w:after="100" w:before="0"/>
+    </w:pPr>
     <w:rPr>
       <w:rFonts w:ascii="Calibri" w:hAnsi="Calibri"/>
-      <w:sz w:val="22"/>
+      <w:sz w:val="21"/>
     </w:rPr>
   </w:style>
   <w:style w:type="paragraph" w:styleId="Header">

</xml_diff>